<commit_message>
Migrate Initial Billing Letter to canonical merge tokens
</commit_message>
<xml_diff>
--- a/templates/docx/letters/initial-billing-letter.docx
+++ b/templates/docx/letters/initial-billing-letter.docx
@@ -241,7 +241,7 @@
               </w:rPr>
             </w:pPr>
             <w:r>
-              <w:t>&lt;&lt;NOWDT&gt;&gt;</w:t>
+              <w:t>{{letter.date}}</w:t>
             </w:r>
           </w:p>
         </w:tc>
@@ -291,11 +291,27 @@
             <w:tcW w:w="9350" w:type="dxa"/>
           </w:tcPr>
           <w:p>
+            <w:p>
+              <w:pPr>
+                <w:jc w:val="both"/>
+              </w:pPr>
+              <w:r>
+                <w:t>{{insurer.name}}</w:t>
+              </w:r>
+            </w:p>
+            <w:p>
+              <w:pPr>
+                <w:jc w:val="both"/>
+              </w:pPr>
+              <w:r>
+                <w:t>{{insurer.mailingAddress.line1}}</w:t>
+              </w:r>
+            </w:p>
             <w:pPr>
               <w:jc w:val="both"/>
             </w:pPr>
             <w:r>
-              <w:t>&lt;&lt;INSURANCECOMPANY_LOCAL_CITY&gt;&gt;, &lt;&lt;INSURANCECOMPANY_LOCAL_STATE&gt;&gt; &lt;&lt;INSURANCECOMPANY_LOCAL_ZIP&gt;&gt;</w:t>
+              <w:t>{{insurer.mailingAddress.city}}, {{insurer.mailingAddress.state}} {{insurer.mailingAddress.zip}}</w:t>
             </w:r>
           </w:p>
         </w:tc>
@@ -363,7 +379,7 @@
           </w:tcPr>
           <w:p>
             <w:r>
-              <w:t>&lt;&lt;PROVIDER_SUITNAME&gt;&gt;</w:t>
+              <w:t>{{provider.name}}</w:t>
             </w:r>
           </w:p>
         </w:tc>
@@ -388,7 +404,7 @@
           </w:tcPr>
           <w:p>
             <w:r>
-              <w:t>&lt;&lt;INJUREDPARTY_NAME&gt;&gt;</w:t>
+              <w:t>{{patient.name}}</w:t>
             </w:r>
           </w:p>
         </w:tc>
@@ -416,7 +432,7 @@
               <w:rPr>
                 <w:color w:val="000000" w:themeColor="text1"/>
               </w:rPr>
-              <w:t>&lt;&lt;INS_CLAIM_NUMBER&gt;&gt;</w:t>
+              <w:t>{{claim.number}}</w:t>
             </w:r>
           </w:p>
         </w:tc>
@@ -441,7 +457,7 @@
           </w:tcPr>
           <w:p>
             <w:r>
-              <w:t>&lt;&lt;BALANCE_AMOUNT&gt;&gt;</w:t>
+              <w:t>{{claim.amount}}</w:t>
             </w:r>
           </w:p>
         </w:tc>
@@ -471,18 +487,18 @@
           </w:tcPr>
           <w:p>
             <w:r>
-              <w:t>&lt;&lt;DOS_START&gt;&gt;</w:t>
+              <w:t>{{claim.dosRange}}</w:t>
             </w:r>
             <w:r>
               <w:t xml:space="preserve"> - </w:t>
             </w:r>
             <w:r>
-              <w:t>&lt;&lt;DOS_END&gt;&gt;</w:t>
+              <w:t/>
             </w:r>
           </w:p>
           <w:p>
             <w:r>
-              <w:t xml:space="preserve">&lt;&lt;CASE_ID&gt;&gt; </w:t>
+              <w:t xml:space="preserve">{{matter.fileNumber}} </w:t>
             </w:r>
           </w:p>
         </w:tc>

</xml_diff>

<commit_message>
Templates Phase 18H restore Word-openable Initial Billing Letter source
</commit_message>
<xml_diff>
--- a/templates/docx/letters/initial-billing-letter.docx
+++ b/templates/docx/letters/initial-billing-letter.docx
@@ -241,7 +241,7 @@
               </w:rPr>
             </w:pPr>
             <w:r>
-              <w:t>{{letter.date}}</w:t>
+              <w:t>&lt;&lt;NOWDT&gt;&gt;</w:t>
             </w:r>
           </w:p>
         </w:tc>
@@ -291,27 +291,11 @@
             <w:tcW w:w="9350" w:type="dxa"/>
           </w:tcPr>
           <w:p>
-            <w:p>
-              <w:pPr>
-                <w:jc w:val="both"/>
-              </w:pPr>
-              <w:r>
-                <w:t>{{insurer.name}}</w:t>
-              </w:r>
-            </w:p>
-            <w:p>
-              <w:pPr>
-                <w:jc w:val="both"/>
-              </w:pPr>
-              <w:r>
-                <w:t>{{insurer.mailingAddress.line1}}</w:t>
-              </w:r>
-            </w:p>
             <w:pPr>
               <w:jc w:val="both"/>
             </w:pPr>
             <w:r>
-              <w:t>{{insurer.mailingAddress.city}}, {{insurer.mailingAddress.state}} {{insurer.mailingAddress.zip}}</w:t>
+              <w:t>&lt;&lt;INSURANCECOMPANY_LOCAL_CITY&gt;&gt;, &lt;&lt;INSURANCECOMPANY_LOCAL_STATE&gt;&gt; &lt;&lt;INSURANCECOMPANY_LOCAL_ZIP&gt;&gt;</w:t>
             </w:r>
           </w:p>
         </w:tc>
@@ -379,7 +363,7 @@
           </w:tcPr>
           <w:p>
             <w:r>
-              <w:t>{{provider.name}}</w:t>
+              <w:t>&lt;&lt;PROVIDER_SUITNAME&gt;&gt;</w:t>
             </w:r>
           </w:p>
         </w:tc>
@@ -404,7 +388,7 @@
           </w:tcPr>
           <w:p>
             <w:r>
-              <w:t>{{patient.name}}</w:t>
+              <w:t>&lt;&lt;INJUREDPARTY_NAME&gt;&gt;</w:t>
             </w:r>
           </w:p>
         </w:tc>
@@ -432,7 +416,7 @@
               <w:rPr>
                 <w:color w:val="000000" w:themeColor="text1"/>
               </w:rPr>
-              <w:t>{{claim.number}}</w:t>
+              <w:t>&lt;&lt;INS_CLAIM_NUMBER&gt;&gt;</w:t>
             </w:r>
           </w:p>
         </w:tc>
@@ -457,7 +441,7 @@
           </w:tcPr>
           <w:p>
             <w:r>
-              <w:t>{{claim.amount}}</w:t>
+              <w:t>&lt;&lt;BALANCE_AMOUNT&gt;&gt;</w:t>
             </w:r>
           </w:p>
         </w:tc>
@@ -487,18 +471,18 @@
           </w:tcPr>
           <w:p>
             <w:r>
-              <w:t>{{claim.dosRange}}</w:t>
+              <w:t>&lt;&lt;DOS_START&gt;&gt;</w:t>
             </w:r>
             <w:r>
               <w:t xml:space="preserve"> - </w:t>
             </w:r>
             <w:r>
-              <w:t/>
+              <w:t>&lt;&lt;DOS_END&gt;&gt;</w:t>
             </w:r>
           </w:p>
           <w:p>
             <w:r>
-              <w:t xml:space="preserve">{{matter.fileNumber}} </w:t>
+              <w:t xml:space="preserve">&lt;&lt;CASE_ID&gt;&gt; </w:t>
             </w:r>
           </w:p>
         </w:tc>

</xml_diff>